<commit_message>
A7 Unit 3 test: the four questions answered in a sentence are cut at Croix's word — 36 points, 16 questions, no transfer item (the key says so); START HERE dates the two thread days; kit 6c8dd856e5c1; Unit 3 rebuilt at 0
Co-Authored-By: Claude Opus 5.5 <noreply@anthropic.com>
Claude-Session: https://claude.ai/code/session_015xYWeLUsuszQH6z7ADE9tj
</commit_message>
<xml_diff>
--- a/a7/build/out/u3/A7 Unit 3 Exponents and Scientific Notation - Test.docx
+++ b/a7/build/out/u3/A7 Unit 3 Exponents and Scientific Notation - Test.docx
@@ -70,7 +70,7 @@
                 <w:color w:val="6B6B6B"/>
                 <w:sz w:val="19"/>
               </w:rPr>
-              <w:t>40 points</w:t>
+              <w:t>36 points</w:t>
             </w:r>
           </w:p>
         </w:tc>
@@ -1432,7 +1432,7 @@
           <w:color w:val="6B6B6B"/>
           <w:sz w:val="19"/>
         </w:rPr>
-        <w:t>11 points</w:t>
+        <w:t>9 points</w:t>
       </w:r>
     </w:p>
     <w:tbl>
@@ -2843,352 +2843,6 @@
         </w:rPr>
       </w:r>
     </w:p>
-    <w:tbl>
-      <w:tblPr>
-        <w:tblLayout w:type="fixed"/>
-        <w:tblLook w:firstColumn="1" w:firstRow="1" w:lastColumn="0" w:lastRow="0" w:noHBand="0" w:noVBand="1" w:val="04A0"/>
-        <w:tblLayout w:type="fixed"/>
-        <w:tblW w:w="9360" w:type="dxa"/>
-      </w:tblPr>
-      <w:tblGrid>
-        <w:gridCol w:w="9360"/>
-      </w:tblGrid>
-      <w:tr>
-        <w:trPr>
-          <w:cantSplit/>
-        </w:trPr>
-        <w:tc>
-          <w:tcPr>
-            <w:tcW w:type="dxa" w:w="9360"/>
-            <w:tcBorders>
-              <w:top w:val="nil"/>
-              <w:left w:val="nil"/>
-              <w:bottom w:val="nil"/>
-              <w:right w:val="nil"/>
-            </w:tcBorders>
-            <w:tcMar>
-              <w:top w:w="0" w:type="dxa"/>
-              <w:left w:w="0" w:type="dxa"/>
-              <w:bottom w:w="0" w:type="dxa"/>
-              <w:right w:w="0" w:type="dxa"/>
-            </w:tcMar>
-          </w:tcPr>
-          <w:p>
-            <w:pPr>
-              <w:spacing w:before="200" w:after="120"/>
-              <w:ind w:left="420" w:hanging="420"/>
-              <w:tabs>
-                <w:tab w:val="right" w:pos="9360"/>
-              </w:tabs>
-            </w:pPr>
-            <w:r>
-              <w:rPr>
-                <w:b/>
-                <w:i w:val="0"/>
-                <w:color w:val="1A1A1A"/>
-                <w:sz w:val="22"/>
-              </w:rPr>
-              <w:t xml:space="preserve">9.   </w:t>
-            </w:r>
-            <w:r>
-              <w:rPr>
-                <w:b w:val="0"/>
-                <w:i w:val="0"/>
-                <w:color w:val="1A1A1A"/>
-                <w:sz w:val="22"/>
-              </w:rPr>
-              <w:t xml:space="preserve">Marco says the value of  </w:t>
-            </w:r>
-            <w:r>
-              <w:drawing>
-                <wp:inline xmlns:a="http://schemas.openxmlformats.org/drawingml/2006/main" xmlns:pic="http://schemas.openxmlformats.org/drawingml/2006/picture">
-                  <wp:extent cx="210312" cy="143256"/>
-                  <wp:docPr id="33" name="Picture 33"/>
-                  <wp:cNvGraphicFramePr>
-                    <a:graphicFrameLocks noChangeAspect="1"/>
-                  </wp:cNvGraphicFramePr>
-                  <a:graphic>
-                    <a:graphicData uri="http://schemas.openxmlformats.org/drawingml/2006/picture">
-                      <pic:pic>
-                        <pic:nvPicPr>
-                          <pic:cNvPr id="0" name="caa3c22aa57edce6.png"/>
-                          <pic:cNvPicPr/>
-                        </pic:nvPicPr>
-                        <pic:blipFill>
-                          <a:blip r:embed="rId41"/>
-                          <a:stretch>
-                            <a:fillRect/>
-                          </a:stretch>
-                        </pic:blipFill>
-                        <pic:spPr>
-                          <a:xfrm>
-                            <a:off x="0" y="0"/>
-                            <a:ext cx="210312" cy="143256"/>
-                          </a:xfrm>
-                          <a:prstGeom prst="rect"/>
-                        </pic:spPr>
-                      </pic:pic>
-                    </a:graphicData>
-                  </a:graphic>
-                </wp:inline>
-              </w:drawing>
-            </w:r>
-            <w:r>
-              <w:rPr>
-                <w:b w:val="0"/>
-                <w:i w:val="0"/>
-                <w:color w:val="1A1A1A"/>
-                <w:sz w:val="22"/>
-              </w:rPr>
-              <w:t xml:space="preserve">  is  </w:t>
-            </w:r>
-            <w:r>
-              <w:drawing>
-                <wp:inline xmlns:a="http://schemas.openxmlformats.org/drawingml/2006/main" xmlns:pic="http://schemas.openxmlformats.org/drawingml/2006/picture">
-                  <wp:extent cx="179832" cy="118872"/>
-                  <wp:docPr id="34" name="Picture 34"/>
-                  <wp:cNvGraphicFramePr>
-                    <a:graphicFrameLocks noChangeAspect="1"/>
-                  </wp:cNvGraphicFramePr>
-                  <a:graphic>
-                    <a:graphicData uri="http://schemas.openxmlformats.org/drawingml/2006/picture">
-                      <pic:pic>
-                        <pic:nvPicPr>
-                          <pic:cNvPr id="0" name="e350934bdbb06339.png"/>
-                          <pic:cNvPicPr/>
-                        </pic:nvPicPr>
-                        <pic:blipFill>
-                          <a:blip r:embed="rId42"/>
-                          <a:stretch>
-                            <a:fillRect/>
-                          </a:stretch>
-                        </pic:blipFill>
-                        <pic:spPr>
-                          <a:xfrm>
-                            <a:off x="0" y="0"/>
-                            <a:ext cx="179832" cy="118872"/>
-                          </a:xfrm>
-                          <a:prstGeom prst="rect"/>
-                        </pic:spPr>
-                      </pic:pic>
-                    </a:graphicData>
-                  </a:graphic>
-                </wp:inline>
-              </w:drawing>
-            </w:r>
-            <w:r>
-              <w:rPr>
-                <w:b w:val="0"/>
-                <w:i w:val="0"/>
-                <w:color w:val="1A1A1A"/>
-                <w:sz w:val="22"/>
-              </w:rPr>
-              <w:t>.  Explain why he is wrong, and give the correct value.</w:t>
-            </w:r>
-            <w:r>
-              <w:tab/>
-            </w:r>
-            <w:r>
-              <w:rPr>
-                <w:b w:val="0"/>
-                <w:i/>
-                <w:color w:val="6B6B6B"/>
-                <w:sz w:val="19"/>
-              </w:rPr>
-              <w:t>1 pt</w:t>
-            </w:r>
-          </w:p>
-          <w:p>
-            <w:pPr>
-              <w:spacing w:after="1728"/>
-            </w:pPr>
-          </w:p>
-        </w:tc>
-      </w:tr>
-    </w:tbl>
-    <w:p>
-      <w:pPr>
-        <w:spacing w:after="0" w:before="0" w:line="20" w:lineRule="exact"/>
-      </w:pPr>
-      <w:r>
-        <w:rPr>
-          <w:sz w:val="2"/>
-        </w:rPr>
-      </w:r>
-    </w:p>
-    <w:tbl>
-      <w:tblPr>
-        <w:tblLayout w:type="fixed"/>
-        <w:tblLook w:firstColumn="1" w:firstRow="1" w:lastColumn="0" w:lastRow="0" w:noHBand="0" w:noVBand="1" w:val="04A0"/>
-        <w:tblLayout w:type="fixed"/>
-        <w:tblW w:w="9360" w:type="dxa"/>
-      </w:tblPr>
-      <w:tblGrid>
-        <w:gridCol w:w="9360"/>
-      </w:tblGrid>
-      <w:tr>
-        <w:trPr>
-          <w:cantSplit/>
-        </w:trPr>
-        <w:tc>
-          <w:tcPr>
-            <w:tcW w:type="dxa" w:w="9360"/>
-            <w:tcBorders>
-              <w:top w:val="nil"/>
-              <w:left w:val="nil"/>
-              <w:bottom w:val="nil"/>
-              <w:right w:val="nil"/>
-            </w:tcBorders>
-            <w:tcMar>
-              <w:top w:w="0" w:type="dxa"/>
-              <w:left w:w="0" w:type="dxa"/>
-              <w:bottom w:w="0" w:type="dxa"/>
-              <w:right w:w="0" w:type="dxa"/>
-            </w:tcMar>
-          </w:tcPr>
-          <w:p>
-            <w:pPr>
-              <w:spacing w:before="200" w:after="120"/>
-              <w:ind w:left="420" w:hanging="420"/>
-              <w:tabs>
-                <w:tab w:val="right" w:pos="9360"/>
-              </w:tabs>
-            </w:pPr>
-            <w:r>
-              <w:rPr>
-                <w:b/>
-                <w:i w:val="0"/>
-                <w:color w:val="1A1A1A"/>
-                <w:sz w:val="22"/>
-              </w:rPr>
-              <w:t xml:space="preserve">10.   </w:t>
-            </w:r>
-            <w:r>
-              <w:rPr>
-                <w:b w:val="0"/>
-                <w:i w:val="0"/>
-                <w:color w:val="1A1A1A"/>
-                <w:sz w:val="22"/>
-              </w:rPr>
-              <w:t xml:space="preserve">Which is greater,  </w:t>
-            </w:r>
-            <w:r>
-              <w:drawing>
-                <wp:inline xmlns:a="http://schemas.openxmlformats.org/drawingml/2006/main" xmlns:pic="http://schemas.openxmlformats.org/drawingml/2006/picture">
-                  <wp:extent cx="210312" cy="140208"/>
-                  <wp:docPr id="35" name="Picture 35"/>
-                  <wp:cNvGraphicFramePr>
-                    <a:graphicFrameLocks noChangeAspect="1"/>
-                  </wp:cNvGraphicFramePr>
-                  <a:graphic>
-                    <a:graphicData uri="http://schemas.openxmlformats.org/drawingml/2006/picture">
-                      <pic:pic>
-                        <pic:nvPicPr>
-                          <pic:cNvPr id="0" name="c3f1b23ff93e0772.png"/>
-                          <pic:cNvPicPr/>
-                        </pic:nvPicPr>
-                        <pic:blipFill>
-                          <a:blip r:embed="rId43"/>
-                          <a:stretch>
-                            <a:fillRect/>
-                          </a:stretch>
-                        </pic:blipFill>
-                        <pic:spPr>
-                          <a:xfrm>
-                            <a:off x="0" y="0"/>
-                            <a:ext cx="210312" cy="140208"/>
-                          </a:xfrm>
-                          <a:prstGeom prst="rect"/>
-                        </pic:spPr>
-                      </pic:pic>
-                    </a:graphicData>
-                  </a:graphic>
-                </wp:inline>
-              </w:drawing>
-            </w:r>
-            <w:r>
-              <w:rPr>
-                <w:b w:val="0"/>
-                <w:i w:val="0"/>
-                <w:color w:val="1A1A1A"/>
-                <w:sz w:val="22"/>
-              </w:rPr>
-              <w:t xml:space="preserve">  or  </w:t>
-            </w:r>
-            <w:r>
-              <w:drawing>
-                <wp:inline xmlns:a="http://schemas.openxmlformats.org/drawingml/2006/main" xmlns:pic="http://schemas.openxmlformats.org/drawingml/2006/picture">
-                  <wp:extent cx="210312" cy="143256"/>
-                  <wp:docPr id="36" name="Picture 36"/>
-                  <wp:cNvGraphicFramePr>
-                    <a:graphicFrameLocks noChangeAspect="1"/>
-                  </wp:cNvGraphicFramePr>
-                  <a:graphic>
-                    <a:graphicData uri="http://schemas.openxmlformats.org/drawingml/2006/picture">
-                      <pic:pic>
-                        <pic:nvPicPr>
-                          <pic:cNvPr id="0" name="caa3c22aa57edce6.png"/>
-                          <pic:cNvPicPr/>
-                        </pic:nvPicPr>
-                        <pic:blipFill>
-                          <a:blip r:embed="rId41"/>
-                          <a:stretch>
-                            <a:fillRect/>
-                          </a:stretch>
-                        </pic:blipFill>
-                        <pic:spPr>
-                          <a:xfrm>
-                            <a:off x="0" y="0"/>
-                            <a:ext cx="210312" cy="143256"/>
-                          </a:xfrm>
-                          <a:prstGeom prst="rect"/>
-                        </pic:spPr>
-                      </pic:pic>
-                    </a:graphicData>
-                  </a:graphic>
-                </wp:inline>
-              </w:drawing>
-            </w:r>
-            <w:r>
-              <w:rPr>
-                <w:b w:val="0"/>
-                <w:i w:val="0"/>
-                <w:color w:val="1A1A1A"/>
-                <w:sz w:val="22"/>
-              </w:rPr>
-              <w:t xml:space="preserve"> ?  Show how you know.</w:t>
-            </w:r>
-            <w:r>
-              <w:tab/>
-            </w:r>
-            <w:r>
-              <w:rPr>
-                <w:b w:val="0"/>
-                <w:i/>
-                <w:color w:val="6B6B6B"/>
-                <w:sz w:val="19"/>
-              </w:rPr>
-              <w:t>1 pt</w:t>
-            </w:r>
-          </w:p>
-          <w:p>
-            <w:pPr>
-              <w:spacing w:after="1440"/>
-            </w:pPr>
-          </w:p>
-        </w:tc>
-      </w:tr>
-    </w:tbl>
-    <w:p>
-      <w:pPr>
-        <w:spacing w:after="0" w:before="0" w:line="20" w:lineRule="exact"/>
-      </w:pPr>
-      <w:r>
-        <w:rPr>
-          <w:sz w:val="2"/>
-        </w:rPr>
-      </w:r>
-    </w:p>
     <w:p>
       <w:pPr>
         <w:keepNext/>
@@ -3219,7 +2873,7 @@
           <w:color w:val="6B6B6B"/>
           <w:sz w:val="19"/>
         </w:rPr>
-        <w:t>9 points</w:t>
+        <w:t>8 points</w:t>
       </w:r>
     </w:p>
     <w:tbl>
@@ -3264,7 +2918,7 @@
                 <w:color w:val="1A1A1A"/>
                 <w:sz w:val="22"/>
               </w:rPr>
-              <w:t xml:space="preserve">11.   </w:t>
+              <w:t xml:space="preserve">9.   </w:t>
             </w:r>
             <w:r>
               <w:rPr>
@@ -3297,7 +2951,7 @@
               <w:drawing>
                 <wp:inline xmlns:a="http://schemas.openxmlformats.org/drawingml/2006/main" xmlns:pic="http://schemas.openxmlformats.org/drawingml/2006/picture">
                   <wp:extent cx="387096" cy="143256"/>
-                  <wp:docPr id="37" name="Picture 37"/>
+                  <wp:docPr id="33" name="Picture 33"/>
                   <wp:cNvGraphicFramePr>
                     <a:graphicFrameLocks noChangeAspect="1"/>
                   </wp:cNvGraphicFramePr>
@@ -3309,7 +2963,7 @@
                           <pic:cNvPicPr/>
                         </pic:nvPicPr>
                         <pic:blipFill>
-                          <a:blip r:embed="rId44"/>
+                          <a:blip r:embed="rId41"/>
                           <a:stretch>
                             <a:fillRect/>
                           </a:stretch>
@@ -3366,7 +3020,7 @@
               <w:drawing>
                 <wp:inline xmlns:a="http://schemas.openxmlformats.org/drawingml/2006/main" xmlns:pic="http://schemas.openxmlformats.org/drawingml/2006/picture">
                   <wp:extent cx="304800" cy="173736"/>
-                  <wp:docPr id="38" name="Picture 38"/>
+                  <wp:docPr id="34" name="Picture 34"/>
                   <wp:cNvGraphicFramePr>
                     <a:graphicFrameLocks noChangeAspect="1"/>
                   </wp:cNvGraphicFramePr>
@@ -3378,7 +3032,7 @@
                           <pic:cNvPicPr/>
                         </pic:nvPicPr>
                         <pic:blipFill>
-                          <a:blip r:embed="rId45"/>
+                          <a:blip r:embed="rId42"/>
                           <a:stretch>
                             <a:fillRect/>
                           </a:stretch>
@@ -3435,7 +3089,7 @@
               <w:drawing>
                 <wp:inline xmlns:a="http://schemas.openxmlformats.org/drawingml/2006/main" xmlns:pic="http://schemas.openxmlformats.org/drawingml/2006/picture">
                   <wp:extent cx="396240" cy="170688"/>
-                  <wp:docPr id="39" name="Picture 39"/>
+                  <wp:docPr id="35" name="Picture 35"/>
                   <wp:cNvGraphicFramePr>
                     <a:graphicFrameLocks noChangeAspect="1"/>
                   </wp:cNvGraphicFramePr>
@@ -3447,7 +3101,7 @@
                           <pic:cNvPicPr/>
                         </pic:nvPicPr>
                         <pic:blipFill>
-                          <a:blip r:embed="rId46"/>
+                          <a:blip r:embed="rId43"/>
                           <a:stretch>
                             <a:fillRect/>
                           </a:stretch>
@@ -3504,7 +3158,7 @@
               <w:drawing>
                 <wp:inline xmlns:a="http://schemas.openxmlformats.org/drawingml/2006/main" xmlns:pic="http://schemas.openxmlformats.org/drawingml/2006/picture">
                   <wp:extent cx="256032" cy="249935"/>
-                  <wp:docPr id="40" name="Picture 40"/>
+                  <wp:docPr id="36" name="Picture 36"/>
                   <wp:cNvGraphicFramePr>
                     <a:graphicFrameLocks noChangeAspect="1"/>
                   </wp:cNvGraphicFramePr>
@@ -3516,7 +3170,7 @@
                           <pic:cNvPicPr/>
                         </pic:nvPicPr>
                         <pic:blipFill>
-                          <a:blip r:embed="rId47"/>
+                          <a:blip r:embed="rId44"/>
                           <a:stretch>
                             <a:fillRect/>
                           </a:stretch>
@@ -3607,7 +3261,7 @@
                 <w:color w:val="1A1A1A"/>
                 <w:sz w:val="22"/>
               </w:rPr>
-              <w:t xml:space="preserve">12.   </w:t>
+              <w:t xml:space="preserve">10.   </w:t>
             </w:r>
             <w:r>
               <w:rPr>
@@ -3640,7 +3294,7 @@
               <w:drawing>
                 <wp:inline xmlns:a="http://schemas.openxmlformats.org/drawingml/2006/main" xmlns:pic="http://schemas.openxmlformats.org/drawingml/2006/picture">
                   <wp:extent cx="231648" cy="143256"/>
-                  <wp:docPr id="41" name="Picture 41"/>
+                  <wp:docPr id="37" name="Picture 37"/>
                   <wp:cNvGraphicFramePr>
                     <a:graphicFrameLocks noChangeAspect="1"/>
                   </wp:cNvGraphicFramePr>
@@ -3652,7 +3306,7 @@
                           <pic:cNvPicPr/>
                         </pic:nvPicPr>
                         <pic:blipFill>
-                          <a:blip r:embed="rId48"/>
+                          <a:blip r:embed="rId45"/>
                           <a:stretch>
                             <a:fillRect/>
                           </a:stretch>
@@ -3709,7 +3363,7 @@
               <w:drawing>
                 <wp:inline xmlns:a="http://schemas.openxmlformats.org/drawingml/2006/main" xmlns:pic="http://schemas.openxmlformats.org/drawingml/2006/picture">
                   <wp:extent cx="295656" cy="143256"/>
-                  <wp:docPr id="42" name="Picture 42"/>
+                  <wp:docPr id="38" name="Picture 38"/>
                   <wp:cNvGraphicFramePr>
                     <a:graphicFrameLocks noChangeAspect="1"/>
                   </wp:cNvGraphicFramePr>
@@ -3721,7 +3375,7 @@
                           <pic:cNvPicPr/>
                         </pic:nvPicPr>
                         <pic:blipFill>
-                          <a:blip r:embed="rId49"/>
+                          <a:blip r:embed="rId46"/>
                           <a:stretch>
                             <a:fillRect/>
                           </a:stretch>
@@ -3778,7 +3432,7 @@
               <w:drawing>
                 <wp:inline xmlns:a="http://schemas.openxmlformats.org/drawingml/2006/main" xmlns:pic="http://schemas.openxmlformats.org/drawingml/2006/picture">
                   <wp:extent cx="597408" cy="170688"/>
-                  <wp:docPr id="43" name="Picture 43"/>
+                  <wp:docPr id="39" name="Picture 39"/>
                   <wp:cNvGraphicFramePr>
                     <a:graphicFrameLocks noChangeAspect="1"/>
                   </wp:cNvGraphicFramePr>
@@ -3790,7 +3444,7 @@
                           <pic:cNvPicPr/>
                         </pic:nvPicPr>
                         <pic:blipFill>
-                          <a:blip r:embed="rId50"/>
+                          <a:blip r:embed="rId47"/>
                           <a:stretch>
                             <a:fillRect/>
                           </a:stretch>
@@ -3884,7 +3538,7 @@
                 <w:color w:val="1A1A1A"/>
                 <w:sz w:val="22"/>
               </w:rPr>
-              <w:t xml:space="preserve">13.   </w:t>
+              <w:t xml:space="preserve">11.   </w:t>
             </w:r>
             <w:r>
               <w:rPr>
@@ -3899,7 +3553,7 @@
               <w:drawing>
                 <wp:inline xmlns:a="http://schemas.openxmlformats.org/drawingml/2006/main" xmlns:pic="http://schemas.openxmlformats.org/drawingml/2006/picture">
                   <wp:extent cx="390144" cy="170688"/>
-                  <wp:docPr id="44" name="Picture 44"/>
+                  <wp:docPr id="40" name="Picture 40"/>
                   <wp:cNvGraphicFramePr>
                     <a:graphicFrameLocks noChangeAspect="1"/>
                   </wp:cNvGraphicFramePr>
@@ -3911,7 +3565,7 @@
                           <pic:cNvPicPr/>
                         </pic:nvPicPr>
                         <pic:blipFill>
-                          <a:blip r:embed="rId51"/>
+                          <a:blip r:embed="rId48"/>
                           <a:stretch>
                             <a:fillRect/>
                           </a:stretch>
@@ -3979,7 +3633,7 @@
               <w:drawing>
                 <wp:inline xmlns:a="http://schemas.openxmlformats.org/drawingml/2006/main" xmlns:pic="http://schemas.openxmlformats.org/drawingml/2006/picture">
                   <wp:extent cx="280416" cy="143256"/>
-                  <wp:docPr id="45" name="Picture 45"/>
+                  <wp:docPr id="41" name="Picture 41"/>
                   <wp:cNvGraphicFramePr>
                     <a:graphicFrameLocks noChangeAspect="1"/>
                   </wp:cNvGraphicFramePr>
@@ -3991,7 +3645,7 @@
                           <pic:cNvPicPr/>
                         </pic:nvPicPr>
                         <pic:blipFill>
-                          <a:blip r:embed="rId52"/>
+                          <a:blip r:embed="rId49"/>
                           <a:stretch>
                             <a:fillRect/>
                           </a:stretch>
@@ -4038,7 +3692,7 @@
               <w:drawing>
                 <wp:inline xmlns:a="http://schemas.openxmlformats.org/drawingml/2006/main" xmlns:pic="http://schemas.openxmlformats.org/drawingml/2006/picture">
                   <wp:extent cx="210312" cy="146304"/>
-                  <wp:docPr id="46" name="Picture 46"/>
+                  <wp:docPr id="42" name="Picture 42"/>
                   <wp:cNvGraphicFramePr>
                     <a:graphicFrameLocks noChangeAspect="1"/>
                   </wp:cNvGraphicFramePr>
@@ -4050,7 +3704,7 @@
                           <pic:cNvPicPr/>
                         </pic:nvPicPr>
                         <pic:blipFill>
-                          <a:blip r:embed="rId53"/>
+                          <a:blip r:embed="rId50"/>
                           <a:stretch>
                             <a:fillRect/>
                           </a:stretch>
@@ -4097,7 +3751,7 @@
               <w:drawing>
                 <wp:inline xmlns:a="http://schemas.openxmlformats.org/drawingml/2006/main" xmlns:pic="http://schemas.openxmlformats.org/drawingml/2006/picture">
                   <wp:extent cx="219456" cy="146304"/>
-                  <wp:docPr id="47" name="Picture 47"/>
+                  <wp:docPr id="43" name="Picture 43"/>
                   <wp:cNvGraphicFramePr>
                     <a:graphicFrameLocks noChangeAspect="1"/>
                   </wp:cNvGraphicFramePr>
@@ -4109,7 +3763,7 @@
                           <pic:cNvPicPr/>
                         </pic:nvPicPr>
                         <pic:blipFill>
-                          <a:blip r:embed="rId54"/>
+                          <a:blip r:embed="rId51"/>
                           <a:stretch>
                             <a:fillRect/>
                           </a:stretch>
@@ -4156,7 +3810,7 @@
               <w:drawing>
                 <wp:inline xmlns:a="http://schemas.openxmlformats.org/drawingml/2006/main" xmlns:pic="http://schemas.openxmlformats.org/drawingml/2006/picture">
                   <wp:extent cx="283464" cy="146304"/>
-                  <wp:docPr id="48" name="Picture 48"/>
+                  <wp:docPr id="44" name="Picture 44"/>
                   <wp:cNvGraphicFramePr>
                     <a:graphicFrameLocks noChangeAspect="1"/>
                   </wp:cNvGraphicFramePr>
@@ -4168,7 +3822,7 @@
                           <pic:cNvPicPr/>
                         </pic:nvPicPr>
                         <pic:blipFill>
-                          <a:blip r:embed="rId55"/>
+                          <a:blip r:embed="rId52"/>
                           <a:stretch>
                             <a:fillRect/>
                           </a:stretch>
@@ -4190,222 +3844,6 @@
           <w:p>
             <w:pPr>
               <w:spacing w:after="1440"/>
-            </w:pPr>
-          </w:p>
-        </w:tc>
-      </w:tr>
-    </w:tbl>
-    <w:p>
-      <w:pPr>
-        <w:spacing w:after="0" w:before="0" w:line="20" w:lineRule="exact"/>
-      </w:pPr>
-      <w:r>
-        <w:rPr>
-          <w:sz w:val="2"/>
-        </w:rPr>
-      </w:r>
-    </w:p>
-    <w:tbl>
-      <w:tblPr>
-        <w:tblLayout w:type="fixed"/>
-        <w:tblLook w:firstColumn="1" w:firstRow="1" w:lastColumn="0" w:lastRow="0" w:noHBand="0" w:noVBand="1" w:val="04A0"/>
-        <w:tblLayout w:type="fixed"/>
-        <w:tblW w:w="9360" w:type="dxa"/>
-      </w:tblPr>
-      <w:tblGrid>
-        <w:gridCol w:w="9360"/>
-      </w:tblGrid>
-      <w:tr>
-        <w:trPr>
-          <w:cantSplit/>
-        </w:trPr>
-        <w:tc>
-          <w:tcPr>
-            <w:tcW w:type="dxa" w:w="9360"/>
-            <w:tcBorders>
-              <w:top w:val="nil"/>
-              <w:left w:val="nil"/>
-              <w:bottom w:val="nil"/>
-              <w:right w:val="nil"/>
-            </w:tcBorders>
-            <w:tcMar>
-              <w:top w:w="0" w:type="dxa"/>
-              <w:left w:w="0" w:type="dxa"/>
-              <w:bottom w:w="0" w:type="dxa"/>
-              <w:right w:w="0" w:type="dxa"/>
-            </w:tcMar>
-          </w:tcPr>
-          <w:p>
-            <w:pPr>
-              <w:spacing w:before="200" w:after="120"/>
-              <w:ind w:left="420" w:hanging="420"/>
-              <w:tabs>
-                <w:tab w:val="right" w:pos="9360"/>
-              </w:tabs>
-            </w:pPr>
-            <w:r>
-              <w:rPr>
-                <w:b/>
-                <w:i w:val="0"/>
-                <w:color w:val="1A1A1A"/>
-                <w:sz w:val="22"/>
-              </w:rPr>
-              <w:t xml:space="preserve">14.   </w:t>
-            </w:r>
-            <w:r>
-              <w:rPr>
-                <w:b w:val="0"/>
-                <w:i w:val="0"/>
-                <w:color w:val="1A1A1A"/>
-                <w:sz w:val="22"/>
-              </w:rPr>
-              <w:t xml:space="preserve">How are  </w:t>
-            </w:r>
-            <w:r>
-              <w:drawing>
-                <wp:inline xmlns:a="http://schemas.openxmlformats.org/drawingml/2006/main" xmlns:pic="http://schemas.openxmlformats.org/drawingml/2006/picture">
-                  <wp:extent cx="143256" cy="143256"/>
-                  <wp:docPr id="49" name="Picture 49"/>
-                  <wp:cNvGraphicFramePr>
-                    <a:graphicFrameLocks noChangeAspect="1"/>
-                  </wp:cNvGraphicFramePr>
-                  <a:graphic>
-                    <a:graphicData uri="http://schemas.openxmlformats.org/drawingml/2006/picture">
-                      <pic:pic>
-                        <pic:nvPicPr>
-                          <pic:cNvPr id="0" name="c57300e6aac13e18.png"/>
-                          <pic:cNvPicPr/>
-                        </pic:nvPicPr>
-                        <pic:blipFill>
-                          <a:blip r:embed="rId56"/>
-                          <a:stretch>
-                            <a:fillRect/>
-                          </a:stretch>
-                        </pic:blipFill>
-                        <pic:spPr>
-                          <a:xfrm>
-                            <a:off x="0" y="0"/>
-                            <a:ext cx="143256" cy="143256"/>
-                          </a:xfrm>
-                          <a:prstGeom prst="rect"/>
-                        </pic:spPr>
-                      </pic:pic>
-                    </a:graphicData>
-                  </a:graphic>
-                </wp:inline>
-              </w:drawing>
-            </w:r>
-            <w:r>
-              <w:rPr>
-                <w:b w:val="0"/>
-                <w:i w:val="0"/>
-                <w:color w:val="1A1A1A"/>
-                <w:sz w:val="22"/>
-              </w:rPr>
-              <w:t xml:space="preserve">  and  </w:t>
-            </w:r>
-            <w:r>
-              <w:drawing>
-                <wp:inline xmlns:a="http://schemas.openxmlformats.org/drawingml/2006/main" xmlns:pic="http://schemas.openxmlformats.org/drawingml/2006/picture">
-                  <wp:extent cx="222504" cy="143256"/>
-                  <wp:docPr id="50" name="Picture 50"/>
-                  <wp:cNvGraphicFramePr>
-                    <a:graphicFrameLocks noChangeAspect="1"/>
-                  </wp:cNvGraphicFramePr>
-                  <a:graphic>
-                    <a:graphicData uri="http://schemas.openxmlformats.org/drawingml/2006/picture">
-                      <pic:pic>
-                        <pic:nvPicPr>
-                          <pic:cNvPr id="0" name="bd2827782daa9140.png"/>
-                          <pic:cNvPicPr/>
-                        </pic:nvPicPr>
-                        <pic:blipFill>
-                          <a:blip r:embed="rId57"/>
-                          <a:stretch>
-                            <a:fillRect/>
-                          </a:stretch>
-                        </pic:blipFill>
-                        <pic:spPr>
-                          <a:xfrm>
-                            <a:off x="0" y="0"/>
-                            <a:ext cx="222504" cy="143256"/>
-                          </a:xfrm>
-                          <a:prstGeom prst="rect"/>
-                        </pic:spPr>
-                      </pic:pic>
-                    </a:graphicData>
-                  </a:graphic>
-                </wp:inline>
-              </w:drawing>
-            </w:r>
-            <w:r>
-              <w:rPr>
-                <w:b w:val="0"/>
-                <w:i w:val="0"/>
-                <w:color w:val="1A1A1A"/>
-                <w:sz w:val="22"/>
-              </w:rPr>
-              <w:t xml:space="preserve">  related? Explain, and give the value of each when  </w:t>
-            </w:r>
-            <w:r>
-              <w:drawing>
-                <wp:inline xmlns:a="http://schemas.openxmlformats.org/drawingml/2006/main" xmlns:pic="http://schemas.openxmlformats.org/drawingml/2006/picture">
-                  <wp:extent cx="313944" cy="118872"/>
-                  <wp:docPr id="51" name="Picture 51"/>
-                  <wp:cNvGraphicFramePr>
-                    <a:graphicFrameLocks noChangeAspect="1"/>
-                  </wp:cNvGraphicFramePr>
-                  <a:graphic>
-                    <a:graphicData uri="http://schemas.openxmlformats.org/drawingml/2006/picture">
-                      <pic:pic>
-                        <pic:nvPicPr>
-                          <pic:cNvPr id="0" name="73dadc06467504fc.png"/>
-                          <pic:cNvPicPr/>
-                        </pic:nvPicPr>
-                        <pic:blipFill>
-                          <a:blip r:embed="rId58"/>
-                          <a:stretch>
-                            <a:fillRect/>
-                          </a:stretch>
-                        </pic:blipFill>
-                        <pic:spPr>
-                          <a:xfrm>
-                            <a:off x="0" y="0"/>
-                            <a:ext cx="313944" cy="118872"/>
-                          </a:xfrm>
-                          <a:prstGeom prst="rect"/>
-                        </pic:spPr>
-                      </pic:pic>
-                    </a:graphicData>
-                  </a:graphic>
-                </wp:inline>
-              </w:drawing>
-            </w:r>
-            <w:r>
-              <w:rPr>
-                <w:b w:val="0"/>
-                <w:i w:val="0"/>
-                <w:color w:val="1A1A1A"/>
-                <w:sz w:val="22"/>
-              </w:rPr>
-              <w:t>.</w:t>
-            </w:r>
-            <w:r>
-              <w:tab/>
-            </w:r>
-            <w:r>
-              <w:rPr>
-                <w:b w:val="0"/>
-                <w:i/>
-                <w:color w:val="6B6B6B"/>
-                <w:sz w:val="19"/>
-              </w:rPr>
-              <w:t>1 pt</w:t>
-            </w:r>
-          </w:p>
-          <w:p>
-            <w:pPr>
-              <w:spacing w:after="1728"/>
             </w:pPr>
           </w:p>
         </w:tc>
@@ -4451,7 +3889,7 @@
           <w:color w:val="6B6B6B"/>
           <w:sz w:val="19"/>
         </w:rPr>
-        <w:t>11 points</w:t>
+        <w:t>10 points</w:t>
       </w:r>
     </w:p>
     <w:tbl>
@@ -4496,7 +3934,7 @@
                 <w:color w:val="1A1A1A"/>
                 <w:sz w:val="22"/>
               </w:rPr>
-              <w:t xml:space="preserve">15.   </w:t>
+              <w:t xml:space="preserve">12.   </w:t>
             </w:r>
             <w:r>
               <w:rPr>
@@ -4739,7 +4177,7 @@
                 <w:color w:val="1A1A1A"/>
                 <w:sz w:val="22"/>
               </w:rPr>
-              <w:t xml:space="preserve">16.   </w:t>
+              <w:t xml:space="preserve">13.   </w:t>
             </w:r>
             <w:r>
               <w:rPr>
@@ -4772,7 +4210,7 @@
               <w:drawing>
                 <wp:inline xmlns:a="http://schemas.openxmlformats.org/drawingml/2006/main" xmlns:pic="http://schemas.openxmlformats.org/drawingml/2006/picture">
                   <wp:extent cx="573024" cy="146304"/>
-                  <wp:docPr id="52" name="Picture 52"/>
+                  <wp:docPr id="45" name="Picture 45"/>
                   <wp:cNvGraphicFramePr>
                     <a:graphicFrameLocks noChangeAspect="1"/>
                   </wp:cNvGraphicFramePr>
@@ -4784,7 +4222,7 @@
                           <pic:cNvPicPr/>
                         </pic:nvPicPr>
                         <pic:blipFill>
-                          <a:blip r:embed="rId59"/>
+                          <a:blip r:embed="rId53"/>
                           <a:stretch>
                             <a:fillRect/>
                           </a:stretch>
@@ -4841,7 +4279,7 @@
               <w:drawing>
                 <wp:inline xmlns:a="http://schemas.openxmlformats.org/drawingml/2006/main" xmlns:pic="http://schemas.openxmlformats.org/drawingml/2006/picture">
                   <wp:extent cx="655320" cy="149352"/>
-                  <wp:docPr id="53" name="Picture 53"/>
+                  <wp:docPr id="46" name="Picture 46"/>
                   <wp:cNvGraphicFramePr>
                     <a:graphicFrameLocks noChangeAspect="1"/>
                   </wp:cNvGraphicFramePr>
@@ -4853,7 +4291,7 @@
                           <pic:cNvPicPr/>
                         </pic:nvPicPr>
                         <pic:blipFill>
-                          <a:blip r:embed="rId60"/>
+                          <a:blip r:embed="rId54"/>
                           <a:stretch>
                             <a:fillRect/>
                           </a:stretch>
@@ -4947,7 +4385,7 @@
                 <w:color w:val="1A1A1A"/>
                 <w:sz w:val="22"/>
               </w:rPr>
-              <w:t xml:space="preserve">17.   </w:t>
+              <w:t xml:space="preserve">14.   </w:t>
             </w:r>
             <w:r>
               <w:rPr>
@@ -4999,7 +4437,7 @@
               <w:drawing>
                 <wp:inline xmlns:a="http://schemas.openxmlformats.org/drawingml/2006/main" xmlns:pic="http://schemas.openxmlformats.org/drawingml/2006/picture">
                   <wp:extent cx="569976" cy="146304"/>
-                  <wp:docPr id="54" name="Picture 54"/>
+                  <wp:docPr id="47" name="Picture 47"/>
                   <wp:cNvGraphicFramePr>
                     <a:graphicFrameLocks noChangeAspect="1"/>
                   </wp:cNvGraphicFramePr>
@@ -5011,7 +4449,7 @@
                           <pic:cNvPicPr/>
                         </pic:nvPicPr>
                         <pic:blipFill>
-                          <a:blip r:embed="rId61"/>
+                          <a:blip r:embed="rId55"/>
                           <a:stretch>
                             <a:fillRect/>
                           </a:stretch>
@@ -5058,7 +4496,7 @@
               <w:drawing>
                 <wp:inline xmlns:a="http://schemas.openxmlformats.org/drawingml/2006/main" xmlns:pic="http://schemas.openxmlformats.org/drawingml/2006/picture">
                   <wp:extent cx="649224" cy="146304"/>
-                  <wp:docPr id="55" name="Picture 55"/>
+                  <wp:docPr id="48" name="Picture 48"/>
                   <wp:cNvGraphicFramePr>
                     <a:graphicFrameLocks noChangeAspect="1"/>
                   </wp:cNvGraphicFramePr>
@@ -5070,7 +4508,7 @@
                           <pic:cNvPicPr/>
                         </pic:nvPicPr>
                         <pic:blipFill>
-                          <a:blip r:embed="rId62"/>
+                          <a:blip r:embed="rId56"/>
                           <a:stretch>
                             <a:fillRect/>
                           </a:stretch>
@@ -5117,7 +4555,7 @@
               <w:drawing>
                 <wp:inline xmlns:a="http://schemas.openxmlformats.org/drawingml/2006/main" xmlns:pic="http://schemas.openxmlformats.org/drawingml/2006/picture">
                   <wp:extent cx="652272" cy="146304"/>
-                  <wp:docPr id="56" name="Picture 56"/>
+                  <wp:docPr id="49" name="Picture 49"/>
                   <wp:cNvGraphicFramePr>
                     <a:graphicFrameLocks noChangeAspect="1"/>
                   </wp:cNvGraphicFramePr>
@@ -5129,7 +4567,7 @@
                           <pic:cNvPicPr/>
                         </pic:nvPicPr>
                         <pic:blipFill>
-                          <a:blip r:embed="rId63"/>
+                          <a:blip r:embed="rId57"/>
                           <a:stretch>
                             <a:fillRect/>
                           </a:stretch>
@@ -5176,7 +4614,7 @@
               <w:drawing>
                 <wp:inline xmlns:a="http://schemas.openxmlformats.org/drawingml/2006/main" xmlns:pic="http://schemas.openxmlformats.org/drawingml/2006/picture">
                   <wp:extent cx="612648" cy="146304"/>
-                  <wp:docPr id="57" name="Picture 57"/>
+                  <wp:docPr id="50" name="Picture 50"/>
                   <wp:cNvGraphicFramePr>
                     <a:graphicFrameLocks noChangeAspect="1"/>
                   </wp:cNvGraphicFramePr>
@@ -5188,7 +4626,7 @@
                           <pic:cNvPicPr/>
                         </pic:nvPicPr>
                         <pic:blipFill>
-                          <a:blip r:embed="rId64"/>
+                          <a:blip r:embed="rId58"/>
                           <a:stretch>
                             <a:fillRect/>
                           </a:stretch>
@@ -5267,7 +4705,7 @@
                 <w:color w:val="1A1A1A"/>
                 <w:sz w:val="22"/>
               </w:rPr>
-              <w:t xml:space="preserve">18.   </w:t>
+              <w:t xml:space="preserve">15.   </w:t>
             </w:r>
             <w:r>
               <w:rPr>
@@ -5309,7 +4747,7 @@
               <w:drawing>
                 <wp:inline xmlns:a="http://schemas.openxmlformats.org/drawingml/2006/main" xmlns:pic="http://schemas.openxmlformats.org/drawingml/2006/picture">
                   <wp:extent cx="454152" cy="146304"/>
-                  <wp:docPr id="58" name="Picture 58"/>
+                  <wp:docPr id="51" name="Picture 51"/>
                   <wp:cNvGraphicFramePr>
                     <a:graphicFrameLocks noChangeAspect="1"/>
                   </wp:cNvGraphicFramePr>
@@ -5321,7 +4759,7 @@
                           <pic:cNvPicPr/>
                         </pic:nvPicPr>
                         <pic:blipFill>
-                          <a:blip r:embed="rId65"/>
+                          <a:blip r:embed="rId59"/>
                           <a:stretch>
                             <a:fillRect/>
                           </a:stretch>
@@ -5352,7 +4790,7 @@
               <w:drawing>
                 <wp:inline xmlns:a="http://schemas.openxmlformats.org/drawingml/2006/main" xmlns:pic="http://schemas.openxmlformats.org/drawingml/2006/picture">
                   <wp:extent cx="451104" cy="149352"/>
-                  <wp:docPr id="59" name="Picture 59"/>
+                  <wp:docPr id="52" name="Picture 52"/>
                   <wp:cNvGraphicFramePr>
                     <a:graphicFrameLocks noChangeAspect="1"/>
                   </wp:cNvGraphicFramePr>
@@ -5364,7 +4802,7 @@
                           <pic:cNvPicPr/>
                         </pic:nvPicPr>
                         <pic:blipFill>
-                          <a:blip r:embed="rId66"/>
+                          <a:blip r:embed="rId60"/>
                           <a:stretch>
                             <a:fillRect/>
                           </a:stretch>
@@ -5439,7 +4877,7 @@
               <w:drawing>
                 <wp:inline xmlns:a="http://schemas.openxmlformats.org/drawingml/2006/main" xmlns:pic="http://schemas.openxmlformats.org/drawingml/2006/picture">
                   <wp:extent cx="655320" cy="146304"/>
-                  <wp:docPr id="60" name="Picture 60"/>
+                  <wp:docPr id="53" name="Picture 53"/>
                   <wp:cNvGraphicFramePr>
                     <a:graphicFrameLocks noChangeAspect="1"/>
                   </wp:cNvGraphicFramePr>
@@ -5451,7 +4889,7 @@
                           <pic:cNvPicPr/>
                         </pic:nvPicPr>
                         <pic:blipFill>
-                          <a:blip r:embed="rId67"/>
+                          <a:blip r:embed="rId61"/>
                           <a:stretch>
                             <a:fillRect/>
                           </a:stretch>
@@ -5482,7 +4920,7 @@
               <w:drawing>
                 <wp:inline xmlns:a="http://schemas.openxmlformats.org/drawingml/2006/main" xmlns:pic="http://schemas.openxmlformats.org/drawingml/2006/picture">
                   <wp:extent cx="637032" cy="143256"/>
-                  <wp:docPr id="61" name="Picture 61"/>
+                  <wp:docPr id="54" name="Picture 54"/>
                   <wp:cNvGraphicFramePr>
                     <a:graphicFrameLocks noChangeAspect="1"/>
                   </wp:cNvGraphicFramePr>
@@ -5494,7 +4932,7 @@
                           <pic:cNvPicPr/>
                         </pic:nvPicPr>
                         <pic:blipFill>
-                          <a:blip r:embed="rId68"/>
+                          <a:blip r:embed="rId62"/>
                           <a:stretch>
                             <a:fillRect/>
                           </a:stretch>
@@ -5597,180 +5035,7 @@
                 <w:color w:val="1A1A1A"/>
                 <w:sz w:val="22"/>
               </w:rPr>
-              <w:t xml:space="preserve">19.   </w:t>
-            </w:r>
-            <w:r>
-              <w:rPr>
-                <w:b w:val="0"/>
-                <w:i w:val="0"/>
-                <w:color w:val="1A1A1A"/>
-                <w:sz w:val="22"/>
-              </w:rPr>
-              <w:t xml:space="preserve">Which is greater,  </w:t>
-            </w:r>
-            <w:r>
-              <w:drawing>
-                <wp:inline xmlns:a="http://schemas.openxmlformats.org/drawingml/2006/main" xmlns:pic="http://schemas.openxmlformats.org/drawingml/2006/picture">
-                  <wp:extent cx="649224" cy="146304"/>
-                  <wp:docPr id="62" name="Picture 62"/>
-                  <wp:cNvGraphicFramePr>
-                    <a:graphicFrameLocks noChangeAspect="1"/>
-                  </wp:cNvGraphicFramePr>
-                  <a:graphic>
-                    <a:graphicData uri="http://schemas.openxmlformats.org/drawingml/2006/picture">
-                      <pic:pic>
-                        <pic:nvPicPr>
-                          <pic:cNvPr id="0" name="19afd0573e8a4e5d.png"/>
-                          <pic:cNvPicPr/>
-                        </pic:nvPicPr>
-                        <pic:blipFill>
-                          <a:blip r:embed="rId69"/>
-                          <a:stretch>
-                            <a:fillRect/>
-                          </a:stretch>
-                        </pic:blipFill>
-                        <pic:spPr>
-                          <a:xfrm>
-                            <a:off x="0" y="0"/>
-                            <a:ext cx="649224" cy="146304"/>
-                          </a:xfrm>
-                          <a:prstGeom prst="rect"/>
-                        </pic:spPr>
-                      </pic:pic>
-                    </a:graphicData>
-                  </a:graphic>
-                </wp:inline>
-              </w:drawing>
-            </w:r>
-            <w:r>
-              <w:rPr>
-                <w:b w:val="0"/>
-                <w:i w:val="0"/>
-                <w:color w:val="1A1A1A"/>
-                <w:sz w:val="22"/>
-              </w:rPr>
-              <w:t xml:space="preserve">  or  </w:t>
-            </w:r>
-            <w:r>
-              <w:drawing>
-                <wp:inline xmlns:a="http://schemas.openxmlformats.org/drawingml/2006/main" xmlns:pic="http://schemas.openxmlformats.org/drawingml/2006/picture">
-                  <wp:extent cx="652272" cy="146304"/>
-                  <wp:docPr id="63" name="Picture 63"/>
-                  <wp:cNvGraphicFramePr>
-                    <a:graphicFrameLocks noChangeAspect="1"/>
-                  </wp:cNvGraphicFramePr>
-                  <a:graphic>
-                    <a:graphicData uri="http://schemas.openxmlformats.org/drawingml/2006/picture">
-                      <pic:pic>
-                        <pic:nvPicPr>
-                          <pic:cNvPr id="0" name="fd5527731cd36ea9.png"/>
-                          <pic:cNvPicPr/>
-                        </pic:nvPicPr>
-                        <pic:blipFill>
-                          <a:blip r:embed="rId70"/>
-                          <a:stretch>
-                            <a:fillRect/>
-                          </a:stretch>
-                        </pic:blipFill>
-                        <pic:spPr>
-                          <a:xfrm>
-                            <a:off x="0" y="0"/>
-                            <a:ext cx="652272" cy="146304"/>
-                          </a:xfrm>
-                          <a:prstGeom prst="rect"/>
-                        </pic:spPr>
-                      </pic:pic>
-                    </a:graphicData>
-                  </a:graphic>
-                </wp:inline>
-              </w:drawing>
-            </w:r>
-            <w:r>
-              <w:rPr>
-                <w:b w:val="0"/>
-                <w:i w:val="0"/>
-                <w:color w:val="1A1A1A"/>
-                <w:sz w:val="22"/>
-              </w:rPr>
-              <w:t xml:space="preserve"> ?  Explain how you know.</w:t>
-            </w:r>
-            <w:r>
-              <w:tab/>
-            </w:r>
-            <w:r>
-              <w:rPr>
-                <w:b w:val="0"/>
-                <w:i/>
-                <w:color w:val="6B6B6B"/>
-                <w:sz w:val="19"/>
-              </w:rPr>
-              <w:t>1 pt</w:t>
-            </w:r>
-          </w:p>
-          <w:p>
-            <w:pPr>
-              <w:spacing w:after="1152"/>
-            </w:pPr>
-          </w:p>
-        </w:tc>
-      </w:tr>
-    </w:tbl>
-    <w:p>
-      <w:pPr>
-        <w:spacing w:after="0" w:before="0" w:line="20" w:lineRule="exact"/>
-      </w:pPr>
-      <w:r>
-        <w:rPr>
-          <w:sz w:val="2"/>
-        </w:rPr>
-      </w:r>
-    </w:p>
-    <w:tbl>
-      <w:tblPr>
-        <w:tblLayout w:type="fixed"/>
-        <w:tblLook w:firstColumn="1" w:firstRow="1" w:lastColumn="0" w:lastRow="0" w:noHBand="0" w:noVBand="1" w:val="04A0"/>
-        <w:tblLayout w:type="fixed"/>
-        <w:tblW w:w="9360" w:type="dxa"/>
-      </w:tblPr>
-      <w:tblGrid>
-        <w:gridCol w:w="9360"/>
-      </w:tblGrid>
-      <w:tr>
-        <w:trPr>
-          <w:cantSplit/>
-        </w:trPr>
-        <w:tc>
-          <w:tcPr>
-            <w:tcW w:type="dxa" w:w="9360"/>
-            <w:tcBorders>
-              <w:top w:val="nil"/>
-              <w:left w:val="nil"/>
-              <w:bottom w:val="nil"/>
-              <w:right w:val="nil"/>
-            </w:tcBorders>
-            <w:tcMar>
-              <w:top w:w="0" w:type="dxa"/>
-              <w:left w:w="0" w:type="dxa"/>
-              <w:bottom w:w="0" w:type="dxa"/>
-              <w:right w:w="0" w:type="dxa"/>
-            </w:tcMar>
-          </w:tcPr>
-          <w:p>
-            <w:pPr>
-              <w:spacing w:before="200" w:after="120"/>
-              <w:ind w:left="420" w:hanging="420"/>
-              <w:tabs>
-                <w:tab w:val="right" w:pos="9360"/>
-              </w:tabs>
-            </w:pPr>
-            <w:r>
-              <w:rPr>
-                <w:b/>
-                <w:i w:val="0"/>
-                <w:color w:val="1A1A1A"/>
-                <w:sz w:val="22"/>
-              </w:rPr>
-              <w:t xml:space="preserve">20.   </w:t>
+              <w:t xml:space="preserve">16.   </w:t>
             </w:r>
             <w:r>
               <w:rPr>

</xml_diff>